<commit_message>
Updatd templates and main script
</commit_message>
<xml_diff>
--- a/DOCS/Annexure-3-Net-Metering.docx
+++ b/DOCS/Annexure-3-Net-Metering.docx
@@ -924,8 +924,6 @@
         </w:rPr>
         <w:t xml:space="preserve"> </w:t>
       </w:r>
-      <w:bookmarkStart w:id="0" w:name="_GoBack"/>
-      <w:bookmarkEnd w:id="0"/>
       <w:r>
         <w:rPr>
           <w:rFonts w:ascii="Times New Roman" w:eastAsia="Times New Roman" w:hAnsi="Times New Roman" w:cs="Times New Roman"/>
@@ -8395,6 +8393,56 @@
           <w:sz w:val="24"/>
         </w:rPr>
       </w:pPr>
+    </w:p>
+    <w:p>
+      <w:pPr>
+        <w:tabs>
+          <w:tab w:val="left" w:pos="819"/>
+          <w:tab w:val="left" w:pos="820"/>
+        </w:tabs>
+        <w:spacing w:after="0" w:line="240" w:lineRule="auto"/>
+        <w:ind w:left="820" w:hanging="720"/>
+        <w:rPr>
+          <w:rFonts w:ascii="Times New Roman" w:eastAsia="Times New Roman" w:hAnsi="Times New Roman" w:cs="Times New Roman"/>
+          <w:b/>
+          <w:color w:val="2F2F2F"/>
+          <w:sz w:val="24"/>
+        </w:rPr>
+      </w:pPr>
+    </w:p>
+    <w:p>
+      <w:pPr>
+        <w:tabs>
+          <w:tab w:val="left" w:pos="819"/>
+          <w:tab w:val="left" w:pos="820"/>
+        </w:tabs>
+        <w:spacing w:after="0" w:line="240" w:lineRule="auto"/>
+        <w:ind w:left="820" w:hanging="720"/>
+        <w:rPr>
+          <w:rFonts w:ascii="Times New Roman" w:eastAsia="Times New Roman" w:hAnsi="Times New Roman" w:cs="Times New Roman"/>
+          <w:b/>
+          <w:color w:val="2F2F2F"/>
+          <w:sz w:val="24"/>
+        </w:rPr>
+      </w:pPr>
+    </w:p>
+    <w:p>
+      <w:pPr>
+        <w:tabs>
+          <w:tab w:val="left" w:pos="819"/>
+          <w:tab w:val="left" w:pos="820"/>
+        </w:tabs>
+        <w:spacing w:after="0" w:line="240" w:lineRule="auto"/>
+        <w:ind w:left="820" w:hanging="720"/>
+        <w:rPr>
+          <w:rFonts w:ascii="Times New Roman" w:eastAsia="Times New Roman" w:hAnsi="Times New Roman" w:cs="Times New Roman"/>
+          <w:b/>
+          <w:color w:val="2F2F2F"/>
+          <w:sz w:val="24"/>
+        </w:rPr>
+      </w:pPr>
+      <w:bookmarkStart w:id="0" w:name="_GoBack"/>
+      <w:bookmarkEnd w:id="0"/>
     </w:p>
     <w:p>
       <w:pPr>
@@ -11085,7 +11133,7 @@
 </file>
 
 <file path=customXml/itemProps1.xml><?xml version="1.0" encoding="utf-8"?>
-<ds:datastoreItem xmlns:ds="http://schemas.openxmlformats.org/officeDocument/2006/customXml" ds:itemID="{90ACF2DB-0BDB-4F09-890C-3EFA6AE19004}">
+<ds:datastoreItem xmlns:ds="http://schemas.openxmlformats.org/officeDocument/2006/customXml" ds:itemID="{833B2752-9F83-4CE6-AFC5-2ED785736E28}">
   <ds:schemaRefs>
     <ds:schemaRef ds:uri="http://schemas.openxmlformats.org/officeDocument/2006/bibliography"/>
   </ds:schemaRefs>

</xml_diff>